<commit_message>
fix(báo cáo): cân đối cột docx, note Mục 5, định dạng #.### ô doanh số
- Template: layout cố định + bề rộng cột dxa hợp lý (khổ A4) cho Mục 1–7
  → tiêu đề không wrap, cột cân đối; mọi ô theo dxa (bỏ pct).
- Mục 5: thêm dòng "- Không phát sinh bảo hành vật tư, linh kiện"
  (hiện khi tháng không có việc Bảo hành; có việc thì điền bảng). Mục 4
  giữ note khiếu nại tương tự.
- Ô Thực tế / Kế hoạch (bảng doanh số): nhập & hiển thị dạng #.### (vi-VN).

Co-Authored-By: Claude Opus 4.8 <noreply@anthropic.com>
</commit_message>
<xml_diff>
--- a/src/lib/report/template.docx
+++ b/src/lib/report/template.docx
@@ -99,14 +99,15 @@
     <w:tbl>
       <w:tblPr>
         <w:tblStyle w:val="TableGrid"/>
-        <w:tblW w:w="5000" w:type="pct"/>
+        <w:tblW w:w="9688" w:type="dxa"/>
+        <w:tblLayout w:type="fixed"/>
         <w:tblLook w:val="04A0" w:firstRow="1" w:lastRow="0" w:firstColumn="1" w:lastColumn="0" w:noHBand="0" w:noVBand="1"/>
       </w:tblPr>
       <w:tblGrid>
-        <w:gridCol w:w="2614"/>
-        <w:gridCol w:w="3210"/>
-        <w:gridCol w:w="3251"/>
-        <w:gridCol w:w="603"/>
+        <w:gridCol w:w="4288"/>
+        <w:gridCol w:w="2000"/>
+        <w:gridCol w:w="1700"/>
+        <w:gridCol w:w="1700"/>
       </w:tblGrid>
       <w:tr>
         <w:trPr>
@@ -114,7 +115,7 @@
         </w:trPr>
         <w:tc>
           <w:tcPr>
-            <w:tcW w:w="2399" w:type="pct"/>
+            <w:tcW w:w="4288" w:type="dxa"/>
             <w:vAlign w:val="center"/>
           </w:tcPr>
           <w:p>
@@ -134,7 +135,7 @@
         </w:tc>
         <w:tc>
           <w:tcPr>
-            <w:tcW w:w="1658" w:type="pct"/>
+            <w:tcW w:w="2000" w:type="dxa"/>
             <w:vAlign w:val="center"/>
           </w:tcPr>
           <w:p>
@@ -154,7 +155,7 @@
         </w:tc>
         <w:tc>
           <w:tcPr>
-            <w:tcW w:w="421" w:type="pct"/>
+            <w:tcW w:w="1700" w:type="dxa"/>
             <w:vAlign w:val="center"/>
           </w:tcPr>
           <w:p>
@@ -174,7 +175,7 @@
         </w:tc>
         <w:tc>
           <w:tcPr>
-            <w:tcW w:w="522" w:type="pct"/>
+            <w:tcW w:w="1700" w:type="dxa"/>
             <w:vAlign w:val="center"/>
           </w:tcPr>
           <w:p>
@@ -199,7 +200,7 @@
         </w:trPr>
         <w:tc>
           <w:tcPr>
-            <w:tcW w:w="2399" w:type="pct"/>
+            <w:tcW w:w="4288" w:type="dxa"/>
             <w:vAlign w:val="center"/>
           </w:tcPr>
           <w:p>
@@ -220,7 +221,7 @@
         </w:tc>
         <w:tc>
           <w:tcPr>
-            <w:tcW w:w="1658" w:type="pct"/>
+            <w:tcW w:w="2000" w:type="dxa"/>
             <w:vAlign w:val="center"/>
           </w:tcPr>
           <w:p>
@@ -242,7 +243,7 @@
         </w:tc>
         <w:tc>
           <w:tcPr>
-            <w:tcW w:w="421" w:type="pct"/>
+            <w:tcW w:w="1700" w:type="dxa"/>
             <w:vAlign w:val="center"/>
           </w:tcPr>
           <w:p>
@@ -264,7 +265,7 @@
         </w:tc>
         <w:tc>
           <w:tcPr>
-            <w:tcW w:w="522" w:type="pct"/>
+            <w:tcW w:w="1700" w:type="dxa"/>
             <w:vAlign w:val="center"/>
           </w:tcPr>
           <w:p>
@@ -283,7 +284,7 @@
         </w:trPr>
         <w:tc>
           <w:tcPr>
-            <w:tcW w:w="2399" w:type="pct"/>
+            <w:tcW w:w="4288" w:type="dxa"/>
             <w:vAlign w:val="center"/>
           </w:tcPr>
           <w:p>
@@ -304,7 +305,7 @@
         </w:tc>
         <w:tc>
           <w:tcPr>
-            <w:tcW w:w="1658" w:type="pct"/>
+            <w:tcW w:w="2000" w:type="dxa"/>
             <w:vAlign w:val="center"/>
           </w:tcPr>
           <w:p>
@@ -326,7 +327,7 @@
         </w:tc>
         <w:tc>
           <w:tcPr>
-            <w:tcW w:w="421" w:type="pct"/>
+            <w:tcW w:w="1700" w:type="dxa"/>
             <w:vAlign w:val="center"/>
           </w:tcPr>
           <w:p>
@@ -348,7 +349,7 @@
         </w:tc>
         <w:tc>
           <w:tcPr>
-            <w:tcW w:w="522" w:type="pct"/>
+            <w:tcW w:w="1700" w:type="dxa"/>
             <w:vAlign w:val="center"/>
           </w:tcPr>
           <w:p>
@@ -367,7 +368,7 @@
         </w:trPr>
         <w:tc>
           <w:tcPr>
-            <w:tcW w:w="2399" w:type="pct"/>
+            <w:tcW w:w="4288" w:type="dxa"/>
             <w:vAlign w:val="center"/>
           </w:tcPr>
           <w:p>
@@ -388,7 +389,7 @@
         </w:tc>
         <w:tc>
           <w:tcPr>
-            <w:tcW w:w="1658" w:type="pct"/>
+            <w:tcW w:w="2000" w:type="dxa"/>
             <w:vAlign w:val="center"/>
           </w:tcPr>
           <w:p>
@@ -410,7 +411,7 @@
         </w:tc>
         <w:tc>
           <w:tcPr>
-            <w:tcW w:w="421" w:type="pct"/>
+            <w:tcW w:w="1700" w:type="dxa"/>
             <w:vAlign w:val="center"/>
           </w:tcPr>
           <w:p>
@@ -432,7 +433,7 @@
         </w:tc>
         <w:tc>
           <w:tcPr>
-            <w:tcW w:w="522" w:type="pct"/>
+            <w:tcW w:w="1700" w:type="dxa"/>
             <w:vAlign w:val="center"/>
           </w:tcPr>
           <w:p>
@@ -451,7 +452,7 @@
         </w:trPr>
         <w:tc>
           <w:tcPr>
-            <w:tcW w:w="2399" w:type="pct"/>
+            <w:tcW w:w="4288" w:type="dxa"/>
             <w:vAlign w:val="center"/>
           </w:tcPr>
           <w:p>
@@ -472,7 +473,7 @@
         </w:tc>
         <w:tc>
           <w:tcPr>
-            <w:tcW w:w="1658" w:type="pct"/>
+            <w:tcW w:w="2000" w:type="dxa"/>
             <w:vAlign w:val="center"/>
           </w:tcPr>
           <w:p>
@@ -494,7 +495,7 @@
         </w:tc>
         <w:tc>
           <w:tcPr>
-            <w:tcW w:w="421" w:type="pct"/>
+            <w:tcW w:w="1700" w:type="dxa"/>
             <w:vAlign w:val="center"/>
           </w:tcPr>
           <w:p>
@@ -516,7 +517,7 @@
         </w:tc>
         <w:tc>
           <w:tcPr>
-            <w:tcW w:w="522" w:type="pct"/>
+            <w:tcW w:w="1700" w:type="dxa"/>
             <w:vAlign w:val="center"/>
           </w:tcPr>
           <w:p>
@@ -535,7 +536,7 @@
         </w:trPr>
         <w:tc>
           <w:tcPr>
-            <w:tcW w:w="2399" w:type="pct"/>
+            <w:tcW w:w="4288" w:type="dxa"/>
             <w:vAlign w:val="center"/>
           </w:tcPr>
           <w:p>
@@ -556,7 +557,7 @@
         </w:tc>
         <w:tc>
           <w:tcPr>
-            <w:tcW w:w="1658" w:type="pct"/>
+            <w:tcW w:w="2000" w:type="dxa"/>
             <w:vAlign w:val="center"/>
           </w:tcPr>
           <w:p>
@@ -578,7 +579,7 @@
         </w:tc>
         <w:tc>
           <w:tcPr>
-            <w:tcW w:w="421" w:type="pct"/>
+            <w:tcW w:w="1700" w:type="dxa"/>
             <w:vAlign w:val="center"/>
           </w:tcPr>
           <w:p>
@@ -600,7 +601,7 @@
         </w:tc>
         <w:tc>
           <w:tcPr>
-            <w:tcW w:w="522" w:type="pct"/>
+            <w:tcW w:w="1700" w:type="dxa"/>
             <w:vAlign w:val="center"/>
           </w:tcPr>
           <w:p>
@@ -619,7 +620,7 @@
         </w:trPr>
         <w:tc>
           <w:tcPr>
-            <w:tcW w:w="2399" w:type="pct"/>
+            <w:tcW w:w="4288" w:type="dxa"/>
             <w:vAlign w:val="center"/>
           </w:tcPr>
           <w:p>
@@ -655,7 +656,7 @@
         </w:tc>
         <w:tc>
           <w:tcPr>
-            <w:tcW w:w="1658" w:type="pct"/>
+            <w:tcW w:w="2000" w:type="dxa"/>
             <w:vAlign w:val="center"/>
           </w:tcPr>
           <w:p>
@@ -677,7 +678,7 @@
         </w:tc>
         <w:tc>
           <w:tcPr>
-            <w:tcW w:w="421" w:type="pct"/>
+            <w:tcW w:w="1700" w:type="dxa"/>
             <w:vAlign w:val="center"/>
           </w:tcPr>
           <w:p>
@@ -699,7 +700,7 @@
         </w:tc>
         <w:tc>
           <w:tcPr>
-            <w:tcW w:w="522" w:type="pct"/>
+            <w:tcW w:w="1700" w:type="dxa"/>
             <w:vAlign w:val="center"/>
           </w:tcPr>
           <w:p>
@@ -718,7 +719,7 @@
         </w:trPr>
         <w:tc>
           <w:tcPr>
-            <w:tcW w:w="2399" w:type="pct"/>
+            <w:tcW w:w="4288" w:type="dxa"/>
             <w:vAlign w:val="center"/>
           </w:tcPr>
           <w:p>
@@ -754,7 +755,7 @@
         </w:tc>
         <w:tc>
           <w:tcPr>
-            <w:tcW w:w="1658" w:type="pct"/>
+            <w:tcW w:w="2000" w:type="dxa"/>
             <w:vAlign w:val="center"/>
           </w:tcPr>
           <w:p>
@@ -776,7 +777,7 @@
         </w:tc>
         <w:tc>
           <w:tcPr>
-            <w:tcW w:w="421" w:type="pct"/>
+            <w:tcW w:w="1700" w:type="dxa"/>
             <w:vAlign w:val="center"/>
           </w:tcPr>
           <w:p>
@@ -798,7 +799,7 @@
         </w:tc>
         <w:tc>
           <w:tcPr>
-            <w:tcW w:w="522" w:type="pct"/>
+            <w:tcW w:w="1700" w:type="dxa"/>
             <w:vAlign w:val="center"/>
           </w:tcPr>
           <w:p>
@@ -817,7 +818,7 @@
         </w:trPr>
         <w:tc>
           <w:tcPr>
-            <w:tcW w:w="2399" w:type="pct"/>
+            <w:tcW w:w="4288" w:type="dxa"/>
             <w:vAlign w:val="center"/>
           </w:tcPr>
           <w:p>
@@ -838,7 +839,7 @@
         </w:tc>
         <w:tc>
           <w:tcPr>
-            <w:tcW w:w="1658" w:type="pct"/>
+            <w:tcW w:w="2000" w:type="dxa"/>
             <w:vAlign w:val="center"/>
           </w:tcPr>
           <w:p>
@@ -860,7 +861,7 @@
         </w:tc>
         <w:tc>
           <w:tcPr>
-            <w:tcW w:w="421" w:type="pct"/>
+            <w:tcW w:w="1700" w:type="dxa"/>
             <w:vAlign w:val="center"/>
           </w:tcPr>
           <w:p>
@@ -882,7 +883,7 @@
         </w:tc>
         <w:tc>
           <w:tcPr>
-            <w:tcW w:w="522" w:type="pct"/>
+            <w:tcW w:w="1700" w:type="dxa"/>
             <w:vAlign w:val="center"/>
           </w:tcPr>
           <w:p>
@@ -901,7 +902,7 @@
         </w:trPr>
         <w:tc>
           <w:tcPr>
-            <w:tcW w:w="2399" w:type="pct"/>
+            <w:tcW w:w="4288" w:type="dxa"/>
             <w:vAlign w:val="center"/>
           </w:tcPr>
           <w:p>
@@ -937,7 +938,7 @@
         </w:tc>
         <w:tc>
           <w:tcPr>
-            <w:tcW w:w="1658" w:type="pct"/>
+            <w:tcW w:w="2000" w:type="dxa"/>
             <w:vAlign w:val="center"/>
           </w:tcPr>
           <w:p>
@@ -959,7 +960,7 @@
         </w:tc>
         <w:tc>
           <w:tcPr>
-            <w:tcW w:w="421" w:type="pct"/>
+            <w:tcW w:w="1700" w:type="dxa"/>
             <w:vAlign w:val="center"/>
           </w:tcPr>
           <w:p>
@@ -981,7 +982,7 @@
         </w:tc>
         <w:tc>
           <w:tcPr>
-            <w:tcW w:w="522" w:type="pct"/>
+            <w:tcW w:w="1700" w:type="dxa"/>
             <w:vAlign w:val="center"/>
           </w:tcPr>
           <w:p>
@@ -1000,7 +1001,7 @@
         </w:trPr>
         <w:tc>
           <w:tcPr>
-            <w:tcW w:w="2399" w:type="pct"/>
+            <w:tcW w:w="4288" w:type="dxa"/>
             <w:vAlign w:val="center"/>
           </w:tcPr>
           <w:p>
@@ -1019,7 +1020,7 @@
         </w:tc>
         <w:tc>
           <w:tcPr>
-            <w:tcW w:w="1658" w:type="pct"/>
+            <w:tcW w:w="2000" w:type="dxa"/>
             <w:vAlign w:val="center"/>
           </w:tcPr>
           <w:p>
@@ -1039,7 +1040,7 @@
         </w:tc>
         <w:tc>
           <w:tcPr>
-            <w:tcW w:w="421" w:type="pct"/>
+            <w:tcW w:w="1700" w:type="dxa"/>
             <w:vAlign w:val="center"/>
           </w:tcPr>
           <w:p>
@@ -1059,7 +1060,7 @@
         </w:tc>
         <w:tc>
           <w:tcPr>
-            <w:tcW w:w="522" w:type="pct"/>
+            <w:tcW w:w="1700" w:type="dxa"/>
             <w:vAlign w:val="center"/>
           </w:tcPr>
           <w:p>
@@ -1112,14 +1113,15 @@
     <w:tbl>
       <w:tblPr>
         <w:tblStyle w:val="TableGrid"/>
-        <w:tblW w:w="5000" w:type="pct"/>
+        <w:tblW w:w="9688" w:type="dxa"/>
+        <w:tblLayout w:type="fixed"/>
         <w:tblLook w:val="04A0" w:firstRow="1" w:lastRow="0" w:firstColumn="1" w:lastColumn="0" w:noHBand="0" w:noVBand="1"/>
       </w:tblPr>
       <w:tblGrid>
-        <w:gridCol w:w="722"/>
-        <w:gridCol w:w="3167"/>
-        <w:gridCol w:w="2817"/>
-        <w:gridCol w:w="2972"/>
+        <w:gridCol w:w="3688"/>
+        <w:gridCol w:w="2000"/>
+        <w:gridCol w:w="2000"/>
+        <w:gridCol w:w="2000"/>
       </w:tblGrid>
       <w:tr>
         <w:trPr>
@@ -1127,7 +1129,7 @@
         </w:trPr>
         <w:tc>
           <w:tcPr>
-            <w:tcW w:w="672" w:type="pct"/>
+            <w:tcW w:w="3688" w:type="dxa"/>
             <w:vAlign w:val="center"/>
           </w:tcPr>
           <w:p>
@@ -1147,7 +1149,7 @@
         </w:tc>
         <w:tc>
           <w:tcPr>
-            <w:tcW w:w="2084" w:type="pct"/>
+            <w:tcW w:w="2000" w:type="dxa"/>
             <w:vAlign w:val="center"/>
           </w:tcPr>
           <w:p>
@@ -1167,7 +1169,7 @@
         </w:tc>
         <w:tc>
           <w:tcPr>
-            <w:tcW w:w="1850" w:type="pct"/>
+            <w:tcW w:w="2000" w:type="dxa"/>
             <w:vAlign w:val="center"/>
           </w:tcPr>
           <w:p>
@@ -1187,7 +1189,7 @@
         </w:tc>
         <w:tc>
           <w:tcPr>
-            <w:tcW w:w="394" w:type="pct"/>
+            <w:tcW w:w="2000" w:type="dxa"/>
             <w:vAlign w:val="center"/>
           </w:tcPr>
           <w:p>
@@ -1212,7 +1214,7 @@
         </w:trPr>
         <w:tc>
           <w:tcPr>
-            <w:tcW w:w="672" w:type="pct"/>
+            <w:tcW w:w="3688" w:type="dxa"/>
             <w:vAlign w:val="center"/>
           </w:tcPr>
           <w:p>
@@ -1233,7 +1235,7 @@
         </w:tc>
         <w:tc>
           <w:tcPr>
-            <w:tcW w:w="2084" w:type="pct"/>
+            <w:tcW w:w="2000" w:type="dxa"/>
             <w:vAlign w:val="center"/>
           </w:tcPr>
           <w:p>
@@ -1255,7 +1257,7 @@
         </w:tc>
         <w:tc>
           <w:tcPr>
-            <w:tcW w:w="1850" w:type="pct"/>
+            <w:tcW w:w="2000" w:type="dxa"/>
             <w:vAlign w:val="center"/>
           </w:tcPr>
           <w:p>
@@ -1277,7 +1279,7 @@
         </w:tc>
         <w:tc>
           <w:tcPr>
-            <w:tcW w:w="394" w:type="pct"/>
+            <w:tcW w:w="2000" w:type="dxa"/>
             <w:vAlign w:val="center"/>
           </w:tcPr>
           <w:p>
@@ -1304,7 +1306,7 @@
         </w:trPr>
         <w:tc>
           <w:tcPr>
-            <w:tcW w:w="672" w:type="pct"/>
+            <w:tcW w:w="3688" w:type="dxa"/>
             <w:vAlign w:val="center"/>
           </w:tcPr>
           <w:p>
@@ -1333,7 +1335,7 @@
         </w:tc>
         <w:tc>
           <w:tcPr>
-            <w:tcW w:w="2084" w:type="pct"/>
+            <w:tcW w:w="2000" w:type="dxa"/>
             <w:vAlign w:val="center"/>
           </w:tcPr>
           <w:p>
@@ -1356,7 +1358,7 @@
         </w:tc>
         <w:tc>
           <w:tcPr>
-            <w:tcW w:w="1850" w:type="pct"/>
+            <w:tcW w:w="2000" w:type="dxa"/>
             <w:vAlign w:val="center"/>
           </w:tcPr>
           <w:p>
@@ -1378,7 +1380,7 @@
         </w:tc>
         <w:tc>
           <w:tcPr>
-            <w:tcW w:w="394" w:type="pct"/>
+            <w:tcW w:w="2000" w:type="dxa"/>
             <w:vAlign w:val="center"/>
           </w:tcPr>
           <w:p>
@@ -1405,7 +1407,7 @@
         </w:trPr>
         <w:tc>
           <w:tcPr>
-            <w:tcW w:w="672" w:type="pct"/>
+            <w:tcW w:w="3688" w:type="dxa"/>
             <w:vAlign w:val="center"/>
           </w:tcPr>
           <w:p>
@@ -1427,7 +1429,7 @@
         </w:tc>
         <w:tc>
           <w:tcPr>
-            <w:tcW w:w="2084" w:type="pct"/>
+            <w:tcW w:w="2000" w:type="dxa"/>
             <w:vAlign w:val="center"/>
           </w:tcPr>
           <w:p>
@@ -1449,7 +1451,7 @@
         </w:tc>
         <w:tc>
           <w:tcPr>
-            <w:tcW w:w="1850" w:type="pct"/>
+            <w:tcW w:w="2000" w:type="dxa"/>
             <w:vAlign w:val="center"/>
           </w:tcPr>
           <w:p>
@@ -1471,7 +1473,7 @@
         </w:tc>
         <w:tc>
           <w:tcPr>
-            <w:tcW w:w="394" w:type="pct"/>
+            <w:tcW w:w="2000" w:type="dxa"/>
             <w:vAlign w:val="center"/>
           </w:tcPr>
           <w:p>
@@ -1498,7 +1500,7 @@
         </w:trPr>
         <w:tc>
           <w:tcPr>
-            <w:tcW w:w="672" w:type="pct"/>
+            <w:tcW w:w="3688" w:type="dxa"/>
             <w:vAlign w:val="center"/>
           </w:tcPr>
           <w:p>
@@ -1519,7 +1521,7 @@
         </w:tc>
         <w:tc>
           <w:tcPr>
-            <w:tcW w:w="2084" w:type="pct"/>
+            <w:tcW w:w="2000" w:type="dxa"/>
             <w:vAlign w:val="center"/>
           </w:tcPr>
           <w:p>
@@ -1541,7 +1543,7 @@
         </w:tc>
         <w:tc>
           <w:tcPr>
-            <w:tcW w:w="1850" w:type="pct"/>
+            <w:tcW w:w="2000" w:type="dxa"/>
             <w:vAlign w:val="center"/>
           </w:tcPr>
           <w:p>
@@ -1563,7 +1565,7 @@
         </w:tc>
         <w:tc>
           <w:tcPr>
-            <w:tcW w:w="394" w:type="pct"/>
+            <w:tcW w:w="2000" w:type="dxa"/>
             <w:vAlign w:val="center"/>
           </w:tcPr>
           <w:p>
@@ -1590,7 +1592,7 @@
         </w:trPr>
         <w:tc>
           <w:tcPr>
-            <w:tcW w:w="672" w:type="pct"/>
+            <w:tcW w:w="3688" w:type="dxa"/>
             <w:vAlign w:val="center"/>
           </w:tcPr>
           <w:p>
@@ -1609,7 +1611,7 @@
         </w:tc>
         <w:tc>
           <w:tcPr>
-            <w:tcW w:w="2084" w:type="pct"/>
+            <w:tcW w:w="2000" w:type="dxa"/>
             <w:vAlign w:val="center"/>
           </w:tcPr>
           <w:p>
@@ -1629,7 +1631,7 @@
         </w:tc>
         <w:tc>
           <w:tcPr>
-            <w:tcW w:w="1850" w:type="pct"/>
+            <w:tcW w:w="2000" w:type="dxa"/>
             <w:vAlign w:val="center"/>
           </w:tcPr>
           <w:p>
@@ -1649,7 +1651,7 @@
         </w:tc>
         <w:tc>
           <w:tcPr>
-            <w:tcW w:w="394" w:type="pct"/>
+            <w:tcW w:w="2000" w:type="dxa"/>
             <w:vAlign w:val="center"/>
           </w:tcPr>
           <w:p>
@@ -1695,13 +1697,14 @@
     <w:tbl>
       <w:tblPr>
         <w:tblStyle w:val="TableGrid"/>
-        <w:tblW w:w="5000" w:type="pct"/>
+        <w:tblW w:w="9688" w:type="dxa"/>
+        <w:tblLayout w:type="fixed"/>
         <w:tblLook w:val="04A0" w:firstRow="1" w:lastRow="0" w:firstColumn="1" w:lastColumn="0" w:noHBand="0" w:noVBand="1"/>
       </w:tblPr>
       <w:tblGrid>
         <w:gridCol w:w="4932"/>
         <w:gridCol w:w="3171"/>
-        <w:gridCol w:w="1575"/>
+        <w:gridCol w:w="1585"/>
       </w:tblGrid>
       <w:tr>
         <w:trPr>
@@ -1709,7 +1712,7 @@
         </w:trPr>
         <w:tc>
           <w:tcPr>
-            <w:tcW w:w="2707" w:type="pct"/>
+            <w:tcW w:w="4932" w:type="dxa"/>
             <w:vAlign w:val="center"/>
           </w:tcPr>
           <w:p>
@@ -1729,7 +1732,7 @@
         </w:tc>
         <w:tc>
           <w:tcPr>
-            <w:tcW w:w="1318" w:type="pct"/>
+            <w:tcW w:w="3171" w:type="dxa"/>
             <w:vAlign w:val="center"/>
           </w:tcPr>
           <w:p>
@@ -1750,7 +1753,7 @@
         </w:tc>
         <w:tc>
           <w:tcPr>
-            <w:tcW w:w="974" w:type="pct"/>
+            <w:tcW w:w="1585" w:type="dxa"/>
             <w:vAlign w:val="center"/>
           </w:tcPr>
           <w:p>
@@ -1776,7 +1779,7 @@
         </w:trPr>
         <w:tc>
           <w:tcPr>
-            <w:tcW w:w="2707" w:type="pct"/>
+            <w:tcW w:w="4932" w:type="dxa"/>
             <w:vAlign w:val="center"/>
           </w:tcPr>
           <w:p>
@@ -1797,7 +1800,7 @@
         </w:tc>
         <w:tc>
           <w:tcPr>
-            <w:tcW w:w="1318" w:type="pct"/>
+            <w:tcW w:w="3171" w:type="dxa"/>
             <w:vAlign w:val="center"/>
           </w:tcPr>
           <w:p>
@@ -1819,7 +1822,7 @@
         </w:tc>
         <w:tc>
           <w:tcPr>
-            <w:tcW w:w="974" w:type="pct"/>
+            <w:tcW w:w="1585" w:type="dxa"/>
             <w:vAlign w:val="center"/>
           </w:tcPr>
           <w:p>
@@ -1839,7 +1842,7 @@
         </w:trPr>
         <w:tc>
           <w:tcPr>
-            <w:tcW w:w="2707" w:type="pct"/>
+            <w:tcW w:w="4932" w:type="dxa"/>
             <w:vAlign w:val="center"/>
           </w:tcPr>
           <w:p>
@@ -1860,7 +1863,7 @@
         </w:tc>
         <w:tc>
           <w:tcPr>
-            <w:tcW w:w="1318" w:type="pct"/>
+            <w:tcW w:w="3171" w:type="dxa"/>
             <w:vAlign w:val="center"/>
           </w:tcPr>
           <w:p>
@@ -1882,7 +1885,7 @@
         </w:tc>
         <w:tc>
           <w:tcPr>
-            <w:tcW w:w="974" w:type="pct"/>
+            <w:tcW w:w="1585" w:type="dxa"/>
             <w:vAlign w:val="center"/>
           </w:tcPr>
           <w:p>
@@ -1902,7 +1905,7 @@
         </w:trPr>
         <w:tc>
           <w:tcPr>
-            <w:tcW w:w="2707" w:type="pct"/>
+            <w:tcW w:w="4932" w:type="dxa"/>
             <w:vAlign w:val="center"/>
           </w:tcPr>
           <w:p>
@@ -1923,7 +1926,7 @@
         </w:tc>
         <w:tc>
           <w:tcPr>
-            <w:tcW w:w="1318" w:type="pct"/>
+            <w:tcW w:w="3171" w:type="dxa"/>
             <w:vAlign w:val="center"/>
           </w:tcPr>
           <w:p>
@@ -1943,7 +1946,7 @@
         </w:tc>
         <w:tc>
           <w:tcPr>
-            <w:tcW w:w="974" w:type="pct"/>
+            <w:tcW w:w="1585" w:type="dxa"/>
             <w:vAlign w:val="center"/>
           </w:tcPr>
           <w:p>
@@ -1991,14 +1994,15 @@
     <w:tbl>
       <w:tblPr>
         <w:tblStyle w:val="TableGrid"/>
-        <w:tblW w:w="5000" w:type="pct"/>
+        <w:tblW w:w="9688" w:type="dxa"/>
+        <w:tblLayout w:type="fixed"/>
         <w:tblLook w:val="04A0" w:firstRow="1" w:lastRow="0" w:firstColumn="1" w:lastColumn="0" w:noHBand="0" w:noVBand="1"/>
       </w:tblPr>
       <w:tblGrid>
-        <w:gridCol w:w="2419"/>
-        <w:gridCol w:w="2419"/>
-        <w:gridCol w:w="2420"/>
-        <w:gridCol w:w="2420"/>
+        <w:gridCol w:w="2422"/>
+        <w:gridCol w:w="2422"/>
+        <w:gridCol w:w="2422"/>
+        <w:gridCol w:w="2422"/>
       </w:tblGrid>
       <w:tr>
         <w:trPr>
@@ -2006,7 +2010,7 @@
         </w:trPr>
         <w:tc>
           <w:tcPr>
-            <w:tcW w:w="1250" w:type="pct"/>
+            <w:tcW w:w="2422" w:type="dxa"/>
           </w:tcPr>
           <w:p>
             <w:pPr>
@@ -2025,7 +2029,7 @@
         </w:tc>
         <w:tc>
           <w:tcPr>
-            <w:tcW w:w="1250" w:type="pct"/>
+            <w:tcW w:w="2422" w:type="dxa"/>
           </w:tcPr>
           <w:p>
             <w:pPr>
@@ -2044,7 +2048,7 @@
         </w:tc>
         <w:tc>
           <w:tcPr>
-            <w:tcW w:w="1250" w:type="pct"/>
+            <w:tcW w:w="2422" w:type="dxa"/>
           </w:tcPr>
           <w:p>
             <w:pPr>
@@ -2063,7 +2067,7 @@
         </w:tc>
         <w:tc>
           <w:tcPr>
-            <w:tcW w:w="1250" w:type="pct"/>
+            <w:tcW w:w="2422" w:type="dxa"/>
           </w:tcPr>
           <w:p>
             <w:pPr>
@@ -2087,7 +2091,7 @@
         </w:trPr>
         <w:tc>
           <w:tcPr>
-            <w:tcW w:w="1250" w:type="pct"/>
+            <w:tcW w:w="2422" w:type="dxa"/>
           </w:tcPr>
           <w:p>
             <w:pPr>
@@ -2107,7 +2111,7 @@
         </w:tc>
         <w:tc>
           <w:tcPr>
-            <w:tcW w:w="1250" w:type="pct"/>
+            <w:tcW w:w="2422" w:type="dxa"/>
           </w:tcPr>
           <w:p>
             <w:pPr>
@@ -2127,7 +2131,7 @@
         </w:tc>
         <w:tc>
           <w:tcPr>
-            <w:tcW w:w="1250" w:type="pct"/>
+            <w:tcW w:w="2422" w:type="dxa"/>
           </w:tcPr>
           <w:p>
             <w:pPr>
@@ -2147,7 +2151,7 @@
         </w:tc>
         <w:tc>
           <w:tcPr>
-            <w:tcW w:w="1250" w:type="pct"/>
+            <w:tcW w:w="2422" w:type="dxa"/>
           </w:tcPr>
           <w:p>
             <w:pPr>
@@ -2188,19 +2192,35 @@
           <w:u w:val="single"/>
         </w:rPr>
         <w:t>5. Bảo hành vật tư, linh kiện:</w:t>
+      </w:r>
+    </w:p>
+    <w:p>
+      <w:pPr>
+        <w:rPr>
+          <w:b w:val="0"/>
+          <w:szCs w:val="24"/>
+        </w:rPr>
+      </w:pPr>
+      <w:r>
+        <w:rPr>
+          <w:b w:val="0"/>
+          <w:szCs w:val="24"/>
+        </w:rPr>
+        <w:t xml:space="preserve">{{^bao_hanh}}- Không phát sinh bảo hành vật tư, linh kiện{{/bao_hanh}}</w:t>
       </w:r>
     </w:p>
     <w:tbl>
       <w:tblPr>
         <w:tblStyle w:val="TableGrid"/>
-        <w:tblW w:w="5000" w:type="pct"/>
+        <w:tblW w:w="9688" w:type="dxa"/>
+        <w:tblLayout w:type="fixed"/>
         <w:tblLook w:val="04A0" w:firstRow="1" w:lastRow="0" w:firstColumn="1" w:lastColumn="0" w:noHBand="0" w:noVBand="1"/>
       </w:tblPr>
       <w:tblGrid>
-        <w:gridCol w:w="2419"/>
-        <w:gridCol w:w="2419"/>
-        <w:gridCol w:w="2420"/>
-        <w:gridCol w:w="2420"/>
+        <w:gridCol w:w="2422"/>
+        <w:gridCol w:w="2422"/>
+        <w:gridCol w:w="2422"/>
+        <w:gridCol w:w="2422"/>
       </w:tblGrid>
       <w:tr>
         <w:trPr>
@@ -2208,7 +2228,7 @@
         </w:trPr>
         <w:tc>
           <w:tcPr>
-            <w:tcW w:w="1250" w:type="pct"/>
+            <w:tcW w:w="2422" w:type="dxa"/>
           </w:tcPr>
           <w:p>
             <w:pPr>
@@ -2227,7 +2247,7 @@
         </w:tc>
         <w:tc>
           <w:tcPr>
-            <w:tcW w:w="1250" w:type="pct"/>
+            <w:tcW w:w="2422" w:type="dxa"/>
           </w:tcPr>
           <w:p>
             <w:pPr>
@@ -2246,7 +2266,7 @@
         </w:tc>
         <w:tc>
           <w:tcPr>
-            <w:tcW w:w="1250" w:type="pct"/>
+            <w:tcW w:w="2422" w:type="dxa"/>
           </w:tcPr>
           <w:p>
             <w:pPr>
@@ -2265,7 +2285,7 @@
         </w:tc>
         <w:tc>
           <w:tcPr>
-            <w:tcW w:w="1250" w:type="pct"/>
+            <w:tcW w:w="2422" w:type="dxa"/>
           </w:tcPr>
           <w:p>
             <w:pPr>
@@ -2289,7 +2309,7 @@
         </w:trPr>
         <w:tc>
           <w:tcPr>
-            <w:tcW w:w="1250" w:type="pct"/>
+            <w:tcW w:w="2422" w:type="dxa"/>
           </w:tcPr>
           <w:p>
             <w:pPr>
@@ -2309,7 +2329,7 @@
         </w:tc>
         <w:tc>
           <w:tcPr>
-            <w:tcW w:w="1250" w:type="pct"/>
+            <w:tcW w:w="2422" w:type="dxa"/>
           </w:tcPr>
           <w:p>
             <w:pPr>
@@ -2329,7 +2349,7 @@
         </w:tc>
         <w:tc>
           <w:tcPr>
-            <w:tcW w:w="1250" w:type="pct"/>
+            <w:tcW w:w="2422" w:type="dxa"/>
           </w:tcPr>
           <w:p>
             <w:pPr>
@@ -2349,7 +2369,7 @@
         </w:tc>
         <w:tc>
           <w:tcPr>
-            <w:tcW w:w="1250" w:type="pct"/>
+            <w:tcW w:w="2422" w:type="dxa"/>
           </w:tcPr>
           <w:p>
             <w:pPr>
@@ -2395,13 +2415,14 @@
     <w:tbl>
       <w:tblPr>
         <w:tblStyle w:val="TableGrid"/>
-        <w:tblW w:w="5000" w:type="pct"/>
+        <w:tblW w:w="9688" w:type="dxa"/>
+        <w:tblLayout w:type="fixed"/>
         <w:tblLook w:val="04A0" w:firstRow="1" w:lastRow="0" w:firstColumn="1" w:lastColumn="0" w:noHBand="0" w:noVBand="1"/>
       </w:tblPr>
       <w:tblGrid>
-        <w:gridCol w:w="3823"/>
-        <w:gridCol w:w="3403"/>
-        <w:gridCol w:w="2452"/>
+        <w:gridCol w:w="4688"/>
+        <w:gridCol w:w="2500"/>
+        <w:gridCol w:w="2500"/>
       </w:tblGrid>
       <w:tr>
         <w:trPr>
@@ -2409,7 +2430,7 @@
         </w:trPr>
         <w:tc>
           <w:tcPr>
-            <w:tcW w:w="1975" w:type="pct"/>
+            <w:tcW w:w="4688" w:type="dxa"/>
             <w:vAlign w:val="center"/>
           </w:tcPr>
           <w:p>
@@ -2429,7 +2450,7 @@
         </w:tc>
         <w:tc>
           <w:tcPr>
-            <w:tcW w:w="1758" w:type="pct"/>
+            <w:tcW w:w="2500" w:type="dxa"/>
             <w:vAlign w:val="center"/>
           </w:tcPr>
           <w:p>
@@ -2449,7 +2470,7 @@
         </w:tc>
         <w:tc>
           <w:tcPr>
-            <w:tcW w:w="1267" w:type="pct"/>
+            <w:tcW w:w="2500" w:type="dxa"/>
             <w:vAlign w:val="center"/>
           </w:tcPr>
           <w:p>
@@ -2474,7 +2495,7 @@
         </w:trPr>
         <w:tc>
           <w:tcPr>
-            <w:tcW w:w="1975" w:type="pct"/>
+            <w:tcW w:w="4688" w:type="dxa"/>
             <w:vAlign w:val="center"/>
           </w:tcPr>
           <w:p>
@@ -2496,7 +2517,7 @@
         </w:tc>
         <w:tc>
           <w:tcPr>
-            <w:tcW w:w="1758" w:type="pct"/>
+            <w:tcW w:w="2500" w:type="dxa"/>
             <w:vAlign w:val="center"/>
           </w:tcPr>
           <w:p>
@@ -2517,7 +2538,7 @@
         </w:tc>
         <w:tc>
           <w:tcPr>
-            <w:tcW w:w="1267" w:type="pct"/>
+            <w:tcW w:w="2500" w:type="dxa"/>
             <w:vAlign w:val="center"/>
           </w:tcPr>
           <w:p>
@@ -2536,7 +2557,7 @@
         </w:trPr>
         <w:tc>
           <w:tcPr>
-            <w:tcW w:w="1975" w:type="pct"/>
+            <w:tcW w:w="4688" w:type="dxa"/>
             <w:vAlign w:val="center"/>
           </w:tcPr>
           <w:p>
@@ -2557,7 +2578,7 @@
         </w:tc>
         <w:tc>
           <w:tcPr>
-            <w:tcW w:w="1758" w:type="pct"/>
+            <w:tcW w:w="2500" w:type="dxa"/>
             <w:vAlign w:val="center"/>
           </w:tcPr>
           <w:p>
@@ -2578,7 +2599,7 @@
         </w:tc>
         <w:tc>
           <w:tcPr>
-            <w:tcW w:w="1267" w:type="pct"/>
+            <w:tcW w:w="2500" w:type="dxa"/>
             <w:vAlign w:val="center"/>
           </w:tcPr>
           <w:p>
@@ -2597,7 +2618,7 @@
         </w:trPr>
         <w:tc>
           <w:tcPr>
-            <w:tcW w:w="1975" w:type="pct"/>
+            <w:tcW w:w="4688" w:type="dxa"/>
             <w:vAlign w:val="center"/>
           </w:tcPr>
           <w:p>
@@ -2618,7 +2639,7 @@
         </w:tc>
         <w:tc>
           <w:tcPr>
-            <w:tcW w:w="1758" w:type="pct"/>
+            <w:tcW w:w="2500" w:type="dxa"/>
             <w:vAlign w:val="center"/>
           </w:tcPr>
           <w:p>
@@ -2639,7 +2660,7 @@
         </w:tc>
         <w:tc>
           <w:tcPr>
-            <w:tcW w:w="1267" w:type="pct"/>
+            <w:tcW w:w="2500" w:type="dxa"/>
             <w:vAlign w:val="center"/>
           </w:tcPr>
           <w:p>
@@ -2679,13 +2700,14 @@
     <w:tbl>
       <w:tblPr>
         <w:tblStyle w:val="TableGrid"/>
-        <w:tblW w:w="5000" w:type="pct"/>
+        <w:tblW w:w="9688" w:type="dxa"/>
+        <w:tblLayout w:type="fixed"/>
         <w:tblLook w:val="04A0" w:firstRow="1" w:lastRow="0" w:firstColumn="1" w:lastColumn="0" w:noHBand="0" w:noVBand="1"/>
       </w:tblPr>
       <w:tblGrid>
-        <w:gridCol w:w="3823"/>
-        <w:gridCol w:w="3403"/>
-        <w:gridCol w:w="2452"/>
+        <w:gridCol w:w="4688"/>
+        <w:gridCol w:w="2500"/>
+        <w:gridCol w:w="2500"/>
       </w:tblGrid>
       <w:tr>
         <w:trPr>
@@ -2693,7 +2715,7 @@
         </w:trPr>
         <w:tc>
           <w:tcPr>
-            <w:tcW w:w="1975" w:type="pct"/>
+            <w:tcW w:w="4688" w:type="dxa"/>
             <w:vAlign w:val="center"/>
           </w:tcPr>
           <w:p>
@@ -2713,7 +2735,7 @@
         </w:tc>
         <w:tc>
           <w:tcPr>
-            <w:tcW w:w="1758" w:type="pct"/>
+            <w:tcW w:w="2500" w:type="dxa"/>
             <w:vAlign w:val="center"/>
           </w:tcPr>
           <w:p>
@@ -2733,7 +2755,7 @@
         </w:tc>
         <w:tc>
           <w:tcPr>
-            <w:tcW w:w="1267" w:type="pct"/>
+            <w:tcW w:w="2500" w:type="dxa"/>
             <w:vAlign w:val="center"/>
           </w:tcPr>
           <w:p>
@@ -2758,7 +2780,7 @@
         </w:trPr>
         <w:tc>
           <w:tcPr>
-            <w:tcW w:w="1975" w:type="pct"/>
+            <w:tcW w:w="4688" w:type="dxa"/>
             <w:vAlign w:val="center"/>
           </w:tcPr>
           <w:p>
@@ -2786,7 +2808,7 @@
         </w:tc>
         <w:tc>
           <w:tcPr>
-            <w:tcW w:w="1758" w:type="pct"/>
+            <w:tcW w:w="2500" w:type="dxa"/>
             <w:vAlign w:val="center"/>
           </w:tcPr>
           <w:p>
@@ -2807,7 +2829,7 @@
         </w:tc>
         <w:tc>
           <w:tcPr>
-            <w:tcW w:w="1267" w:type="pct"/>
+            <w:tcW w:w="2500" w:type="dxa"/>
             <w:vAlign w:val="center"/>
           </w:tcPr>
           <w:p>
@@ -2826,7 +2848,7 @@
         </w:trPr>
         <w:tc>
           <w:tcPr>
-            <w:tcW w:w="1975" w:type="pct"/>
+            <w:tcW w:w="4688" w:type="dxa"/>
             <w:vAlign w:val="center"/>
           </w:tcPr>
           <w:p>
@@ -2847,7 +2869,7 @@
         </w:tc>
         <w:tc>
           <w:tcPr>
-            <w:tcW w:w="1758" w:type="pct"/>
+            <w:tcW w:w="2500" w:type="dxa"/>
             <w:vAlign w:val="center"/>
           </w:tcPr>
           <w:p>
@@ -2868,7 +2890,7 @@
         </w:tc>
         <w:tc>
           <w:tcPr>
-            <w:tcW w:w="1267" w:type="pct"/>
+            <w:tcW w:w="2500" w:type="dxa"/>
             <w:vAlign w:val="center"/>
           </w:tcPr>
           <w:p>
@@ -2887,7 +2909,7 @@
         </w:trPr>
         <w:tc>
           <w:tcPr>
-            <w:tcW w:w="1975" w:type="pct"/>
+            <w:tcW w:w="4688" w:type="dxa"/>
             <w:vAlign w:val="center"/>
           </w:tcPr>
           <w:p>
@@ -2908,7 +2930,7 @@
         </w:tc>
         <w:tc>
           <w:tcPr>
-            <w:tcW w:w="1758" w:type="pct"/>
+            <w:tcW w:w="2500" w:type="dxa"/>
             <w:vAlign w:val="center"/>
           </w:tcPr>
           <w:p>
@@ -2929,7 +2951,7 @@
         </w:tc>
         <w:tc>
           <w:tcPr>
-            <w:tcW w:w="1267" w:type="pct"/>
+            <w:tcW w:w="2500" w:type="dxa"/>
             <w:vAlign w:val="center"/>
           </w:tcPr>
           <w:p>
@@ -2948,7 +2970,7 @@
         </w:trPr>
         <w:tc>
           <w:tcPr>
-            <w:tcW w:w="1975" w:type="pct"/>
+            <w:tcW w:w="4688" w:type="dxa"/>
             <w:vAlign w:val="center"/>
           </w:tcPr>
           <w:p>
@@ -2969,7 +2991,7 @@
         </w:tc>
         <w:tc>
           <w:tcPr>
-            <w:tcW w:w="1758" w:type="pct"/>
+            <w:tcW w:w="2500" w:type="dxa"/>
             <w:vAlign w:val="center"/>
           </w:tcPr>
           <w:p>
@@ -2990,7 +3012,7 @@
         </w:tc>
         <w:tc>
           <w:tcPr>
-            <w:tcW w:w="1267" w:type="pct"/>
+            <w:tcW w:w="2500" w:type="dxa"/>
             <w:vAlign w:val="center"/>
           </w:tcPr>
           <w:p>

</xml_diff>

<commit_message>
fix(bao-cao-thang): chuẩn hóa hãng, chống cap 1000 dòng, Mục 4/5 bảng 2 cột
- brandKey khớp chuỗi con bỏ dấu: gom Konica Minolta→Konica,
  Fujifilm/FujiXerox→Fuji (cột báo cáo giữ tên Konica/Fuji)
- Mục 4/5: template rút còn 2 cột (Khách hàng | Nội dung=ghi_chu),
  vẫn giữ dòng "Không phát sinh" khi tháng không có phiếu
- Nạp công việc chỉ trong tháng + selectAll cho jobs/custs (né cap ~1000 dòng)
- MF vẫn thuộc HĐBT (đúng nghiệp vụ), giữ nguyên đếm mọi trạng thái

Co-Authored-By: Claude Opus 4.8 <noreply@anthropic.com>
</commit_message>
<xml_diff>
--- a/src/lib/report/template.docx
+++ b/src/lib/report/template.docx
@@ -1999,10 +1999,8 @@
         <w:tblLook w:val="04A0" w:firstRow="1" w:lastRow="0" w:firstColumn="1" w:lastColumn="0" w:noHBand="0" w:noVBand="1"/>
       </w:tblPr>
       <w:tblGrid>
-        <w:gridCol w:w="2422"/>
-        <w:gridCol w:w="2422"/>
-        <w:gridCol w:w="2422"/>
-        <w:gridCol w:w="2422"/>
+        <w:gridCol w:w="3874"/>
+        <w:gridCol w:w="5814"/>
       </w:tblGrid>
       <w:tr>
         <w:trPr>
@@ -2010,7 +2008,7 @@
         </w:trPr>
         <w:tc>
           <w:tcPr>
-            <w:tcW w:w="2422" w:type="dxa"/>
+            <w:tcW w:w="3874" w:type="dxa"/>
           </w:tcPr>
           <w:p>
             <w:pPr>
@@ -2029,26 +2027,7 @@
         </w:tc>
         <w:tc>
           <w:tcPr>
-            <w:tcW w:w="2422" w:type="dxa"/>
-          </w:tcPr>
-          <w:p>
-            <w:pPr>
-              <w:jc w:val="center"/>
-              <w:rPr>
-                <w:szCs w:val="24"/>
-              </w:rPr>
-            </w:pPr>
-            <w:r>
-              <w:rPr>
-                <w:szCs w:val="24"/>
-              </w:rPr>
-              <w:t>Địa chỉ</w:t>
-            </w:r>
-          </w:p>
-        </w:tc>
-        <w:tc>
-          <w:tcPr>
-            <w:tcW w:w="2422" w:type="dxa"/>
+            <w:tcW w:w="5814" w:type="dxa"/>
           </w:tcPr>
           <w:p>
             <w:pPr>
@@ -2062,25 +2041,6 @@
                 <w:szCs w:val="24"/>
               </w:rPr>
               <w:t>Nội dung</w:t>
-            </w:r>
-          </w:p>
-        </w:tc>
-        <w:tc>
-          <w:tcPr>
-            <w:tcW w:w="2422" w:type="dxa"/>
-          </w:tcPr>
-          <w:p>
-            <w:pPr>
-              <w:jc w:val="center"/>
-              <w:rPr>
-                <w:szCs w:val="24"/>
-              </w:rPr>
-            </w:pPr>
-            <w:r>
-              <w:rPr>
-                <w:szCs w:val="24"/>
-              </w:rPr>
-              <w:t>Kết quả</w:t>
             </w:r>
           </w:p>
         </w:tc>
@@ -2091,7 +2051,7 @@
         </w:trPr>
         <w:tc>
           <w:tcPr>
-            <w:tcW w:w="2422" w:type="dxa"/>
+            <w:tcW w:w="3874" w:type="dxa"/>
           </w:tcPr>
           <w:p>
             <w:pPr>
@@ -2111,61 +2071,21 @@
         </w:tc>
         <w:tc>
           <w:tcPr>
-            <w:tcW w:w="2422" w:type="dxa"/>
-          </w:tcPr>
-          <w:p>
-            <w:pPr>
-              <w:rPr>
-                <w:b w:val="0"/>
-                <w:szCs w:val="24"/>
-              </w:rPr>
-            </w:pPr>
-            <w:r>
-              <w:rPr>
-                <w:b w:val="0"/>
-                <w:szCs w:val="24"/>
-              </w:rPr>
-              <w:t xml:space="preserve">{{dia_chi}}</w:t>
-            </w:r>
-          </w:p>
-        </w:tc>
-        <w:tc>
-          <w:tcPr>
-            <w:tcW w:w="2422" w:type="dxa"/>
-          </w:tcPr>
-          <w:p>
-            <w:pPr>
-              <w:rPr>
-                <w:b w:val="0"/>
-                <w:szCs w:val="24"/>
-              </w:rPr>
-            </w:pPr>
-            <w:r>
-              <w:rPr>
-                <w:b w:val="0"/>
-                <w:szCs w:val="24"/>
-              </w:rPr>
-              <w:t xml:space="preserve">{{noi_dung}}</w:t>
-            </w:r>
-          </w:p>
-        </w:tc>
-        <w:tc>
-          <w:tcPr>
-            <w:tcW w:w="2422" w:type="dxa"/>
-          </w:tcPr>
-          <w:p>
-            <w:pPr>
-              <w:rPr>
-                <w:b w:val="0"/>
-                <w:szCs w:val="24"/>
-              </w:rPr>
-            </w:pPr>
-            <w:r>
-              <w:rPr>
-                <w:b w:val="0"/>
-                <w:szCs w:val="24"/>
-              </w:rPr>
-              <w:t xml:space="preserve">{{ket_qua}}{{/khieu_nai}}</w:t>
+            <w:tcW w:w="5814" w:type="dxa"/>
+          </w:tcPr>
+          <w:p>
+            <w:pPr>
+              <w:rPr>
+                <w:b w:val="0"/>
+                <w:szCs w:val="24"/>
+              </w:rPr>
+            </w:pPr>
+            <w:r>
+              <w:rPr>
+                <w:b w:val="0"/>
+                <w:szCs w:val="24"/>
+              </w:rPr>
+              <w:t xml:space="preserve">{{noi_dung}}{{/khieu_nai}}</w:t>
             </w:r>
           </w:p>
         </w:tc>
@@ -2217,10 +2137,8 @@
         <w:tblLook w:val="04A0" w:firstRow="1" w:lastRow="0" w:firstColumn="1" w:lastColumn="0" w:noHBand="0" w:noVBand="1"/>
       </w:tblPr>
       <w:tblGrid>
-        <w:gridCol w:w="2422"/>
-        <w:gridCol w:w="2422"/>
-        <w:gridCol w:w="2422"/>
-        <w:gridCol w:w="2422"/>
+        <w:gridCol w:w="3874"/>
+        <w:gridCol w:w="5814"/>
       </w:tblGrid>
       <w:tr>
         <w:trPr>
@@ -2228,7 +2146,7 @@
         </w:trPr>
         <w:tc>
           <w:tcPr>
-            <w:tcW w:w="2422" w:type="dxa"/>
+            <w:tcW w:w="3874" w:type="dxa"/>
           </w:tcPr>
           <w:p>
             <w:pPr>
@@ -2247,26 +2165,7 @@
         </w:tc>
         <w:tc>
           <w:tcPr>
-            <w:tcW w:w="2422" w:type="dxa"/>
-          </w:tcPr>
-          <w:p>
-            <w:pPr>
-              <w:jc w:val="center"/>
-              <w:rPr>
-                <w:szCs w:val="24"/>
-              </w:rPr>
-            </w:pPr>
-            <w:r>
-              <w:rPr>
-                <w:szCs w:val="24"/>
-              </w:rPr>
-              <w:t>Địa chỉ</w:t>
-            </w:r>
-          </w:p>
-        </w:tc>
-        <w:tc>
-          <w:tcPr>
-            <w:tcW w:w="2422" w:type="dxa"/>
+            <w:tcW w:w="5814" w:type="dxa"/>
           </w:tcPr>
           <w:p>
             <w:pPr>
@@ -2280,25 +2179,6 @@
                 <w:szCs w:val="24"/>
               </w:rPr>
               <w:t>Nội dung</w:t>
-            </w:r>
-          </w:p>
-        </w:tc>
-        <w:tc>
-          <w:tcPr>
-            <w:tcW w:w="2422" w:type="dxa"/>
-          </w:tcPr>
-          <w:p>
-            <w:pPr>
-              <w:jc w:val="center"/>
-              <w:rPr>
-                <w:szCs w:val="24"/>
-              </w:rPr>
-            </w:pPr>
-            <w:r>
-              <w:rPr>
-                <w:szCs w:val="24"/>
-              </w:rPr>
-              <w:t>Kết quả</w:t>
             </w:r>
           </w:p>
         </w:tc>
@@ -2309,7 +2189,7 @@
         </w:trPr>
         <w:tc>
           <w:tcPr>
-            <w:tcW w:w="2422" w:type="dxa"/>
+            <w:tcW w:w="3874" w:type="dxa"/>
           </w:tcPr>
           <w:p>
             <w:pPr>
@@ -2329,61 +2209,21 @@
         </w:tc>
         <w:tc>
           <w:tcPr>
-            <w:tcW w:w="2422" w:type="dxa"/>
-          </w:tcPr>
-          <w:p>
-            <w:pPr>
-              <w:rPr>
-                <w:b w:val="0"/>
-                <w:szCs w:val="24"/>
-              </w:rPr>
-            </w:pPr>
-            <w:r>
-              <w:rPr>
-                <w:b w:val="0"/>
-                <w:szCs w:val="24"/>
-              </w:rPr>
-              <w:t xml:space="preserve">{{dia_chi}}</w:t>
-            </w:r>
-          </w:p>
-        </w:tc>
-        <w:tc>
-          <w:tcPr>
-            <w:tcW w:w="2422" w:type="dxa"/>
-          </w:tcPr>
-          <w:p>
-            <w:pPr>
-              <w:rPr>
-                <w:b w:val="0"/>
-                <w:szCs w:val="24"/>
-              </w:rPr>
-            </w:pPr>
-            <w:r>
-              <w:rPr>
-                <w:b w:val="0"/>
-                <w:szCs w:val="24"/>
-              </w:rPr>
-              <w:t xml:space="preserve">{{noi_dung}}</w:t>
-            </w:r>
-          </w:p>
-        </w:tc>
-        <w:tc>
-          <w:tcPr>
-            <w:tcW w:w="2422" w:type="dxa"/>
-          </w:tcPr>
-          <w:p>
-            <w:pPr>
-              <w:rPr>
-                <w:b w:val="0"/>
-                <w:szCs w:val="24"/>
-              </w:rPr>
-            </w:pPr>
-            <w:r>
-              <w:rPr>
-                <w:b w:val="0"/>
-                <w:szCs w:val="24"/>
-              </w:rPr>
-              <w:t xml:space="preserve">{{ket_qua}}{{/bao_hanh}}</w:t>
+            <w:tcW w:w="5814" w:type="dxa"/>
+          </w:tcPr>
+          <w:p>
+            <w:pPr>
+              <w:rPr>
+                <w:b w:val="0"/>
+                <w:szCs w:val="24"/>
+              </w:rPr>
+            </w:pPr>
+            <w:r>
+              <w:rPr>
+                <w:b w:val="0"/>
+                <w:szCs w:val="24"/>
+              </w:rPr>
+              <w:t xml:space="preserve">{{noi_dung}}{{/bao_hanh}}</w:t>
             </w:r>
           </w:p>
         </w:tc>

</xml_diff>